<commit_message>
MD-80: Add co rte
</commit_message>
<xml_diff>
--- a/HT9100/HT9100_FMS_and_MCDU.docx
+++ b/HT9100/HT9100_FMS_and_MCDU.docx
@@ -101,7 +101,7 @@
           <w:sz w:val="24"/>
           <w:szCs w:val="24"/>
         </w:rPr>
-        <w:t>9/11/2025</w:t>
+        <w:t>4/7/2026</w:t>
       </w:r>
       <w:r>
         <w:rPr>
@@ -1279,15 +1279,7 @@
     </w:p>
     <w:p>
       <w:r>
-        <w:t xml:space="preserve">The HT9100 originally came with “advisory VNAV”, which displayed very basic vertical navigation information on the MCDU. This functionality did not consider aircraft performance, and could not be coupled to an autopilot. As a </w:t>
-      </w:r>
-      <w:proofErr w:type="gramStart"/>
-      <w:r>
-        <w:t>result</w:t>
-      </w:r>
-      <w:proofErr w:type="gramEnd"/>
-      <w:r>
-        <w:t xml:space="preserve"> it was not very useful. This version of the HT9100 has advisory VNAV removed, and functions only as a lateral FMS, such as the competing CMA900.</w:t>
+        <w:t>The HT9100 originally came with “advisory VNAV”, which displayed very basic vertical navigation information on the MCDU. This functionality did not consider aircraft performance, and could not be coupled to an autopilot. As a result it was not very useful. This version of the HT9100 has advisory VNAV removed, and functions only as a lateral FMS, such as the competing CMA900.</w:t>
       </w:r>
     </w:p>
     <w:p>
@@ -4311,45 +4303,18 @@
       </w:pPr>
       <w:bookmarkStart w:id="11" w:name="_Toc208524660"/>
       <w:r>
-        <w:t xml:space="preserve">NEAREST </w:t>
-      </w:r>
-      <w:r>
-        <w:t>AIRPORTS</w:t>
+        <w:t>NEAREST AIRPORTS</w:t>
       </w:r>
       <w:bookmarkEnd w:id="11"/>
     </w:p>
     <w:p>
       <w:r>
-        <w:t xml:space="preserve">This page allows information about various </w:t>
-      </w:r>
-      <w:r>
-        <w:t>near</w:t>
-      </w:r>
-      <w:r>
-        <w:t xml:space="preserve">by airports to be displayed. It is accessed from the </w:t>
-      </w:r>
-      <w:r>
-        <w:t>NEAREST</w:t>
-      </w:r>
-      <w:r>
-        <w:t xml:space="preserve"> INDEX page.</w:t>
+        <w:t>This page allows information about various nearby airports to be displayed. It is accessed from the NEAREST INDEX page.</w:t>
       </w:r>
     </w:p>
     <w:p>
       <w:r>
-        <w:t xml:space="preserve">The </w:t>
-      </w:r>
-      <w:r>
-        <w:t>5</w:t>
-      </w:r>
-      <w:r>
-        <w:t xml:space="preserve"> closest airports in the database will be displayed with their bearing and distance in lines 1L through </w:t>
-      </w:r>
-      <w:r>
-        <w:t>5</w:t>
-      </w:r>
-      <w:r>
-        <w:t>L.</w:t>
+        <w:t>The 5 closest airports in the database will be displayed with their bearing and distance in lines 1L through 5L.</w:t>
       </w:r>
     </w:p>
     <w:p/>
@@ -4359,25 +4324,13 @@
       </w:pPr>
       <w:bookmarkStart w:id="12" w:name="_Toc208524661"/>
       <w:r>
-        <w:t>NEAREST</w:t>
-      </w:r>
-      <w:r>
-        <w:t xml:space="preserve"> INDEX</w:t>
+        <w:t>NEAREST INDEX</w:t>
       </w:r>
       <w:bookmarkEnd w:id="12"/>
     </w:p>
     <w:p>
       <w:r>
-        <w:t xml:space="preserve">This page is a menu that allows selection of </w:t>
-      </w:r>
-      <w:r>
-        <w:t>nearest reference</w:t>
-      </w:r>
-      <w:r>
-        <w:t xml:space="preserve"> pages. It is accessed </w:t>
-      </w:r>
-      <w:r>
-        <w:t>from the DATA INDEX page.</w:t>
+        <w:t>This page is a menu that allows selection of nearest reference pages. It is accessed from the DATA INDEX page.</w:t>
       </w:r>
     </w:p>
     <w:p>
@@ -4543,13 +4496,13 @@
     </w:p>
     <w:p>
       <w:r>
-        <w:t xml:space="preserve">A stored Company Route can be </w:t>
-      </w:r>
-      <w:r>
-        <w:t xml:space="preserve">entered </w:t>
-      </w:r>
-      <w:r>
-        <w:t>into field 3R. This feature will be used to allow external flight plan files to be loaded in a future version.</w:t>
+        <w:t xml:space="preserve">A stored Company Route can be entered into field </w:t>
+      </w:r>
+      <w:r>
+        <w:t>3R</w:t>
+      </w:r>
+      <w:r>
+        <w:t>. This allows you to load .gpx or .fgfp files placed $FG_HOME/Export. Enter the filename without the extension to load it. Note that this feature is not complete.</w:t>
       </w:r>
     </w:p>
     <w:p>

</xml_diff>